<commit_message>
al momento de que realice la descarga de los word, por ejemplo que descarga con el nombre Peaton_Fallecido_Apellidos, el UT1, ileso o fallecido, placa y apellido de conductor, asi mismo en las descargas de word de manifestaciones que diga como nombre del archivo la calidad (sea investigado, familiar, propietario) seguido de los apellidos
</commit_message>
<xml_diff>
--- a/plantillas/word_informe_peaton_fallecido.docx
+++ b/plantillas/word_informe_peaton_fallecido.docx
@@ -54,31 +54,21 @@
         </w:rPr>
         <w:t>${</w:t>
       </w:r>
-      <w:proofErr w:type="spellStart"/>
-      <w:r>
-        <w:rPr>
-          <w:sz w:val="24"/>
-          <w:szCs w:val="24"/>
-          <w:lang w:val="es-ES_tradnl"/>
-        </w:rPr>
-        <w:t>PREFIX_fall_nombre</w:t>
-      </w:r>
-      <w:proofErr w:type="spellEnd"/>
-      <w:r>
-        <w:rPr>
-          <w:sz w:val="24"/>
-          <w:szCs w:val="24"/>
-          <w:lang w:val="es-ES_tradnl"/>
-        </w:rPr>
-        <w:t>}</w:t>
-      </w:r>
-      <w:r>
-        <w:rPr>
-          <w:sz w:val="24"/>
-          <w:szCs w:val="24"/>
-          <w:lang w:val="es-ES_tradnl"/>
-        </w:rPr>
-        <w:t xml:space="preserve">, </w:t>
+      <w:r>
+        <w:rPr>
+          <w:sz w:val="24"/>
+          <w:szCs w:val="24"/>
+          <w:lang w:val="es-ES_tradnl"/>
+        </w:rPr>
+        <w:t>p1</w:t>
+      </w:r>
+      <w:r>
+        <w:rPr>
+          <w:sz w:val="24"/>
+          <w:szCs w:val="24"/>
+          <w:lang w:val="es-ES_tradnl"/>
+        </w:rPr>
+        <w:t xml:space="preserve">_fall_nombre}, </w:t>
       </w:r>
       <w:r>
         <w:rPr>
@@ -97,23 +87,21 @@
         </w:rPr>
         <w:t>${</w:t>
       </w:r>
-      <w:proofErr w:type="spellStart"/>
-      <w:r>
-        <w:rPr>
-          <w:sz w:val="24"/>
-          <w:szCs w:val="24"/>
-          <w:lang w:val="es-ES_tradnl"/>
-        </w:rPr>
-        <w:t>PREFIX_fall_edad_accidente</w:t>
-      </w:r>
-      <w:proofErr w:type="spellEnd"/>
-      <w:r>
-        <w:rPr>
-          <w:sz w:val="24"/>
-          <w:szCs w:val="24"/>
-          <w:lang w:val="es-ES_tradnl"/>
-        </w:rPr>
-        <w:t>}</w:t>
+      <w:r>
+        <w:rPr>
+          <w:sz w:val="24"/>
+          <w:szCs w:val="24"/>
+          <w:lang w:val="es-ES_tradnl"/>
+        </w:rPr>
+        <w:t>p1</w:t>
+      </w:r>
+      <w:r>
+        <w:rPr>
+          <w:sz w:val="24"/>
+          <w:szCs w:val="24"/>
+          <w:lang w:val="es-ES_tradnl"/>
+        </w:rPr>
+        <w:t>_fall_edad_accidente}</w:t>
       </w:r>
       <w:r>
         <w:rPr>
@@ -125,18 +113,7 @@
         <w:t xml:space="preserve"> años, se identificaba con </w:t>
       </w:r>
       <w:r>
-        <w:t>${</w:t>
-      </w:r>
-      <w:proofErr w:type="spellStart"/>
-      <w:r>
-        <w:t>PREFIX_fall_doc</w:t>
-      </w:r>
-      <w:proofErr w:type="spellEnd"/>
-      <w:r>
-        <w:t>}</w:t>
-      </w:r>
-      <w:r>
-        <w:t xml:space="preserve">, </w:t>
+        <w:t xml:space="preserve">${p1_fall_doc}, </w:t>
       </w:r>
       <w:r>
         <w:rPr>
@@ -157,15 +134,7 @@
         <w:t xml:space="preserve">l </w:t>
       </w:r>
       <w:r>
-        <w:t>${</w:t>
-      </w:r>
-      <w:proofErr w:type="spellStart"/>
-      <w:r>
-        <w:t>PREFIX_fall_estado_civil</w:t>
-      </w:r>
-      <w:proofErr w:type="spellEnd"/>
-      <w:r>
-        <w:t>}</w:t>
+        <w:t>${p1_fall_estado_civil}</w:t>
       </w:r>
       <w:r>
         <w:rPr>
@@ -186,15 +155,7 @@
         <w:t xml:space="preserve"> </w:t>
       </w:r>
       <w:r>
-        <w:t>${</w:t>
-      </w:r>
-      <w:proofErr w:type="spellStart"/>
-      <w:r>
-        <w:t>PREFIX_fall_domicilio</w:t>
-      </w:r>
-      <w:proofErr w:type="spellEnd"/>
-      <w:r>
-        <w:t>}</w:t>
+        <w:t>${p1_fall_domicilio}</w:t>
       </w:r>
       <w:r>
         <w:rPr>
@@ -294,13 +255,7 @@
       </w:r>
       <w:proofErr w:type="spellEnd"/>
       <w:r>
-        <w:t>}</w:t>
-      </w:r>
-      <w:r>
-        <w:t>-</w:t>
-      </w:r>
-      <w:r>
-        <w:t>${</w:t>
+        <w:t>}-${</w:t>
       </w:r>
       <w:proofErr w:type="spellStart"/>
       <w:r>
@@ -512,13 +467,11 @@
       <w:r>
         <w:t>${</w:t>
       </w:r>
-      <w:proofErr w:type="spellStart"/>
-      <w:r>
-        <w:t>PREFIX_fam_parentesco</w:t>
-      </w:r>
-      <w:proofErr w:type="spellEnd"/>
-      <w:r>
-        <w:t>}</w:t>
+      <w:r>
+        <w:t>P1</w:t>
+      </w:r>
+      <w:r>
+        <w:t>_fam_parentesco}</w:t>
       </w:r>
       <w:r>
         <w:rPr>
@@ -558,15 +511,7 @@
       </w:pPr>
       <w:bookmarkStart w:id="0" w:name="_Hlk167115045"/>
       <w:r>
-        <w:t>${</w:t>
-      </w:r>
-      <w:proofErr w:type="spellStart"/>
-      <w:r>
-        <w:t>PREFIX_fam_nombre</w:t>
-      </w:r>
-      <w:proofErr w:type="spellEnd"/>
-      <w:r>
-        <w:t>}</w:t>
+        <w:t>${p1_fam_nombre}</w:t>
       </w:r>
       <w:r>
         <w:rPr>
@@ -578,15 +523,7 @@
         <w:t xml:space="preserve">, de </w:t>
       </w:r>
       <w:r>
-        <w:t>${</w:t>
-      </w:r>
-      <w:proofErr w:type="spellStart"/>
-      <w:r>
-        <w:t>PREFIX_fam_edad_registrada</w:t>
-      </w:r>
-      <w:proofErr w:type="spellEnd"/>
-      <w:r>
-        <w:t>}</w:t>
+        <w:t>${p1_fam_edad_registrada}</w:t>
       </w:r>
       <w:r>
         <w:rPr>
@@ -607,15 +544,7 @@
         <w:t xml:space="preserve"> </w:t>
       </w:r>
       <w:r>
-        <w:t>${</w:t>
-      </w:r>
-      <w:proofErr w:type="spellStart"/>
-      <w:r>
-        <w:t>PREFIX_fam_fecha_nacimiento</w:t>
-      </w:r>
-      <w:proofErr w:type="spellEnd"/>
-      <w:r>
-        <w:t>}</w:t>
+        <w:t>${p1_fam_fecha_nacimiento}</w:t>
       </w:r>
       <w:r>
         <w:rPr>
@@ -636,15 +565,7 @@
         <w:t xml:space="preserve"> </w:t>
       </w:r>
       <w:r>
-        <w:t>${</w:t>
-      </w:r>
-      <w:proofErr w:type="spellStart"/>
-      <w:r>
-        <w:t>PREFIX_fam_estado_civil</w:t>
-      </w:r>
-      <w:proofErr w:type="spellEnd"/>
-      <w:r>
-        <w:t>}</w:t>
+        <w:t>${p1_fam_estado_civil}</w:t>
       </w:r>
       <w:r>
         <w:rPr>
@@ -665,15 +586,7 @@
         <w:t xml:space="preserve"> </w:t>
       </w:r>
       <w:r>
-        <w:t>${</w:t>
-      </w:r>
-      <w:proofErr w:type="spellStart"/>
-      <w:r>
-        <w:t>PREFIX_fam_ocupacion</w:t>
-      </w:r>
-      <w:proofErr w:type="spellEnd"/>
-      <w:r>
-        <w:t>}</w:t>
+        <w:t>${p1_fam_ocupacion}</w:t>
       </w:r>
       <w:r>
         <w:rPr>
@@ -694,42 +607,16 @@
         <w:t xml:space="preserve"> </w:t>
       </w:r>
       <w:r>
-        <w:t>${</w:t>
-      </w:r>
-      <w:proofErr w:type="spellStart"/>
-      <w:r>
-        <w:t>PREFIX_fam_nacimiento</w:t>
-      </w:r>
-      <w:proofErr w:type="spellEnd"/>
-      <w:r>
-        <w:t>}</w:t>
-      </w:r>
-      <w:r>
-        <w:rPr>
-          <w:color w:val="FF0000"/>
-          <w:sz w:val="24"/>
-          <w:szCs w:val="24"/>
-          <w:lang w:val="es-ES_tradnl"/>
-        </w:rPr>
-        <w:t>, hij</w:t>
-      </w:r>
-      <w:r>
-        <w:rPr>
-          <w:color w:val="FF0000"/>
-          <w:sz w:val="24"/>
-          <w:szCs w:val="24"/>
-          <w:lang w:val="es-ES_tradnl"/>
-        </w:rPr>
-        <w:t>o</w:t>
-      </w:r>
-      <w:r>
-        <w:rPr>
-          <w:color w:val="FF0000"/>
-          <w:sz w:val="24"/>
-          <w:szCs w:val="24"/>
-          <w:lang w:val="es-ES_tradnl"/>
-        </w:rPr>
-        <w:t xml:space="preserve"> de</w:t>
+        <w:t>${p1_fam_nacimiento}</w:t>
+      </w:r>
+      <w:r>
+        <w:rPr>
+          <w:color w:val="FF0000"/>
+          <w:sz w:val="24"/>
+          <w:szCs w:val="24"/>
+          <w:lang w:val="es-ES_tradnl"/>
+        </w:rPr>
+        <w:t>, hijo de</w:t>
       </w:r>
       <w:r>
         <w:rPr>
@@ -741,29 +628,7 @@
         <w:t xml:space="preserve"> </w:t>
       </w:r>
       <w:r>
-        <w:t>${</w:t>
-      </w:r>
-      <w:proofErr w:type="spellStart"/>
-      <w:r>
-        <w:t>PREFIX_fam_padre</w:t>
-      </w:r>
-      <w:proofErr w:type="spellEnd"/>
-      <w:r>
-        <w:t>}</w:t>
-      </w:r>
-      <w:r>
-        <w:t xml:space="preserve"> y </w:t>
-      </w:r>
-      <w:r>
-        <w:t>${</w:t>
-      </w:r>
-      <w:proofErr w:type="spellStart"/>
-      <w:r>
-        <w:t>PREFIX_fam_madre</w:t>
-      </w:r>
-      <w:proofErr w:type="spellEnd"/>
-      <w:r>
-        <w:t>}</w:t>
+        <w:t>${p1_fam_padre} y ${p1_fam_madre}</w:t>
       </w:r>
       <w:r>
         <w:rPr>
@@ -784,15 +649,7 @@
         <w:t xml:space="preserve"> </w:t>
       </w:r>
       <w:r>
-        <w:t>${</w:t>
-      </w:r>
-      <w:proofErr w:type="spellStart"/>
-      <w:r>
-        <w:t>PREFIX_fam_domicilio</w:t>
-      </w:r>
-      <w:proofErr w:type="spellEnd"/>
-      <w:r>
-        <w:t>}</w:t>
+        <w:t>${p1_fam_domicilio}</w:t>
       </w:r>
       <w:r>
         <w:rPr>
@@ -854,7 +711,16 @@
           <w:szCs w:val="24"/>
           <w:lang w:val="es-ES_tradnl"/>
         </w:rPr>
-        <w:t>Recibida el</w:t>
+        <w:t>Re</w:t>
+      </w:r>
+      <w:r>
+        <w:rPr>
+          <w:color w:val="FF0000"/>
+          <w:sz w:val="24"/>
+          <w:szCs w:val="24"/>
+          <w:lang w:val="es-ES_tradnl"/>
+        </w:rPr>
+        <w:t>cibida el</w:t>
       </w:r>
       <w:r>
         <w:rPr>
@@ -873,6 +739,99 @@
         </w:rPr>
         <w:t>${</w:t>
       </w:r>
+      <w:r>
+        <w:rPr>
+          <w:sz w:val="24"/>
+          <w:szCs w:val="24"/>
+          <w:lang w:val="es-ES_tradnl"/>
+        </w:rPr>
+        <w:t>p1</w:t>
+      </w:r>
+      <w:r>
+        <w:rPr>
+          <w:sz w:val="24"/>
+          <w:szCs w:val="24"/>
+          <w:lang w:val="es-ES_tradnl"/>
+        </w:rPr>
+        <w:t>_fam_man_fecha},</w:t>
+      </w:r>
+      <w:r>
+        <w:rPr>
+          <w:color w:val="FF0000"/>
+          <w:sz w:val="24"/>
+          <w:szCs w:val="24"/>
+          <w:lang w:val="es-ES_tradnl"/>
+        </w:rPr>
+        <w:t xml:space="preserve"> a horas</w:t>
+      </w:r>
+      <w:r>
+        <w:rPr>
+          <w:color w:val="FF0000"/>
+          <w:sz w:val="24"/>
+          <w:szCs w:val="24"/>
+          <w:lang w:val="es-ES_tradnl"/>
+        </w:rPr>
+        <w:t xml:space="preserve"> </w:t>
+      </w:r>
+      <w:r>
+        <w:rPr>
+          <w:sz w:val="24"/>
+          <w:szCs w:val="24"/>
+          <w:lang w:val="es-ES_tradnl"/>
+        </w:rPr>
+        <w:t>${</w:t>
+      </w:r>
+      <w:r>
+        <w:rPr>
+          <w:sz w:val="24"/>
+          <w:szCs w:val="24"/>
+          <w:lang w:val="es-ES_tradnl"/>
+        </w:rPr>
+        <w:t>p1</w:t>
+      </w:r>
+      <w:r>
+        <w:rPr>
+          <w:sz w:val="24"/>
+          <w:szCs w:val="24"/>
+          <w:lang w:val="es-ES_tradnl"/>
+        </w:rPr>
+        <w:t>_fall_man_hora_inicio}</w:t>
+      </w:r>
+      <w:r>
+        <w:rPr>
+          <w:color w:val="FF0000"/>
+          <w:sz w:val="24"/>
+          <w:szCs w:val="24"/>
+          <w:lang w:val="es-ES_tradnl"/>
+        </w:rPr>
+        <w:t xml:space="preserve">, en </w:t>
+      </w:r>
+      <w:r>
+        <w:rPr>
+          <w:color w:val="FF0000"/>
+          <w:sz w:val="24"/>
+          <w:szCs w:val="24"/>
+          <w:lang w:val="es-ES_tradnl"/>
+        </w:rPr>
+        <w:t>la</w:t>
+      </w:r>
+      <w:r>
+        <w:rPr>
+          <w:color w:val="FF0000"/>
+          <w:sz w:val="24"/>
+          <w:szCs w:val="24"/>
+          <w:lang w:val="es-ES_tradnl"/>
+        </w:rPr>
+        <w:t xml:space="preserve"> oficina de la unidad de investigación de accidentes de tránsito norte, con la participación de la representante del ministerio público, </w:t>
+      </w:r>
+      <w:r>
+        <w:rPr>
+          <w:sz w:val="24"/>
+          <w:szCs w:val="24"/>
+          <w:lang w:val="es-ES_tradnl"/>
+        </w:rPr>
+        <w:t>${</w:t>
+      </w:r>
       <w:proofErr w:type="spellStart"/>
       <w:r>
         <w:rPr>
@@ -880,7 +839,7 @@
           <w:szCs w:val="24"/>
           <w:lang w:val="es-ES_tradnl"/>
         </w:rPr>
-        <w:t>PREFIX_fam_man_fecha</w:t>
+        <w:t>acc_fiscal</w:t>
       </w:r>
       <w:proofErr w:type="spellEnd"/>
       <w:r>
@@ -889,24 +848,16 @@
           <w:szCs w:val="24"/>
           <w:lang w:val="es-ES_tradnl"/>
         </w:rPr>
-        <w:t>}</w:t>
-      </w:r>
-      <w:r>
-        <w:rPr>
-          <w:sz w:val="24"/>
-          <w:szCs w:val="24"/>
-          <w:lang w:val="es-ES_tradnl"/>
-        </w:rPr>
-        <w:t>,</w:t>
-      </w:r>
-      <w:r>
-        <w:rPr>
-          <w:color w:val="FF0000"/>
-          <w:sz w:val="24"/>
-          <w:szCs w:val="24"/>
-          <w:lang w:val="es-ES_tradnl"/>
-        </w:rPr>
-        <w:t xml:space="preserve"> a horas</w:t>
+        <w:t xml:space="preserve">}, </w:t>
+      </w:r>
+      <w:r>
+        <w:rPr>
+          <w:color w:val="FF0000"/>
+          <w:sz w:val="24"/>
+          <w:szCs w:val="24"/>
+          <w:lang w:val="es-ES_tradnl"/>
+        </w:rPr>
+        <w:t>del</w:t>
       </w:r>
       <w:r>
         <w:rPr>
@@ -932,7 +883,7 @@
           <w:szCs w:val="24"/>
           <w:lang w:val="es-ES_tradnl"/>
         </w:rPr>
-        <w:t>PREFIX_fall_man_hora_inicio</w:t>
+        <w:t>acc_fiscalia</w:t>
       </w:r>
       <w:proofErr w:type="spellEnd"/>
       <w:r>
@@ -941,120 +892,7 @@
           <w:szCs w:val="24"/>
           <w:lang w:val="es-ES_tradnl"/>
         </w:rPr>
-        <w:t>}</w:t>
-      </w:r>
-      <w:r>
-        <w:rPr>
-          <w:color w:val="FF0000"/>
-          <w:sz w:val="24"/>
-          <w:szCs w:val="24"/>
-          <w:lang w:val="es-ES_tradnl"/>
-        </w:rPr>
-        <w:t xml:space="preserve">, en </w:t>
-      </w:r>
-      <w:r>
-        <w:rPr>
-          <w:color w:val="FF0000"/>
-          <w:sz w:val="24"/>
-          <w:szCs w:val="24"/>
-          <w:lang w:val="es-ES_tradnl"/>
-        </w:rPr>
-        <w:t>la</w:t>
-      </w:r>
-      <w:r>
-        <w:rPr>
-          <w:color w:val="FF0000"/>
-          <w:sz w:val="24"/>
-          <w:szCs w:val="24"/>
-          <w:lang w:val="es-ES_tradnl"/>
-        </w:rPr>
-        <w:t xml:space="preserve"> oficina de la Unidad de Investigación de Accidentes de Tránsito Norte, con la participación de la representante del Ministerio Público, </w:t>
-      </w:r>
-      <w:r>
-        <w:rPr>
-          <w:sz w:val="24"/>
-          <w:szCs w:val="24"/>
-          <w:lang w:val="es-ES_tradnl"/>
-        </w:rPr>
-        <w:t>${</w:t>
-      </w:r>
-      <w:proofErr w:type="spellStart"/>
-      <w:r>
-        <w:rPr>
-          <w:sz w:val="24"/>
-          <w:szCs w:val="24"/>
-          <w:lang w:val="es-ES_tradnl"/>
-        </w:rPr>
-        <w:t>acc_fiscal</w:t>
-      </w:r>
-      <w:proofErr w:type="spellEnd"/>
-      <w:r>
-        <w:rPr>
-          <w:sz w:val="24"/>
-          <w:szCs w:val="24"/>
-          <w:lang w:val="es-ES_tradnl"/>
-        </w:rPr>
-        <w:t>}</w:t>
-      </w:r>
-      <w:r>
-        <w:rPr>
-          <w:sz w:val="24"/>
-          <w:szCs w:val="24"/>
-          <w:lang w:val="es-ES_tradnl"/>
-        </w:rPr>
-        <w:t xml:space="preserve">, </w:t>
-      </w:r>
-      <w:r>
-        <w:rPr>
-          <w:color w:val="FF0000"/>
-          <w:sz w:val="24"/>
-          <w:szCs w:val="24"/>
-          <w:lang w:val="es-ES_tradnl"/>
-        </w:rPr>
-        <w:t>del</w:t>
-      </w:r>
-      <w:r>
-        <w:rPr>
-          <w:color w:val="FF0000"/>
-          <w:sz w:val="24"/>
-          <w:szCs w:val="24"/>
-          <w:lang w:val="es-ES_tradnl"/>
-        </w:rPr>
-        <w:t xml:space="preserve"> </w:t>
-      </w:r>
-      <w:r>
-        <w:rPr>
-          <w:sz w:val="24"/>
-          <w:szCs w:val="24"/>
-          <w:lang w:val="es-ES_tradnl"/>
-        </w:rPr>
-        <w:t>${</w:t>
-      </w:r>
-      <w:proofErr w:type="spellStart"/>
-      <w:r>
-        <w:rPr>
-          <w:sz w:val="24"/>
-          <w:szCs w:val="24"/>
-          <w:lang w:val="es-ES_tradnl"/>
-        </w:rPr>
-        <w:t>acc_fiscalia</w:t>
-      </w:r>
-      <w:proofErr w:type="spellEnd"/>
-      <w:r>
-        <w:rPr>
-          <w:sz w:val="24"/>
-          <w:szCs w:val="24"/>
-          <w:lang w:val="es-ES_tradnl"/>
-        </w:rPr>
-        <w:t>}</w:t>
-      </w:r>
-      <w:r>
-        <w:rPr>
-          <w:sz w:val="24"/>
-          <w:szCs w:val="24"/>
-          <w:lang w:val="es-ES_tradnl"/>
-        </w:rPr>
-        <w:t>.</w:t>
+        <w:t>}.</w:t>
       </w:r>
     </w:p>
     <w:bookmarkEnd w:id="1"/>
@@ -1107,7 +945,16 @@
           <w:szCs w:val="24"/>
           <w:lang w:val="es-ES_tradnl"/>
         </w:rPr>
-        <w:t>Diligencia llevada a cabo el</w:t>
+        <w:t xml:space="preserve">Diligencia </w:t>
+      </w:r>
+      <w:r>
+        <w:rPr>
+          <w:color w:val="FF0000"/>
+          <w:sz w:val="24"/>
+          <w:szCs w:val="24"/>
+          <w:lang w:val="es-ES_tradnl"/>
+        </w:rPr>
+        <w:t>llevada a cabo el</w:t>
       </w:r>
       <w:r>
         <w:rPr>
@@ -1126,32 +973,203 @@
         </w:rPr>
         <w:t>${</w:t>
       </w:r>
+      <w:r>
+        <w:rPr>
+          <w:sz w:val="24"/>
+          <w:szCs w:val="24"/>
+          <w:lang w:val="es-ES_tradnl"/>
+        </w:rPr>
+        <w:t>p1</w:t>
+      </w:r>
+      <w:r>
+        <w:rPr>
+          <w:sz w:val="24"/>
+          <w:szCs w:val="24"/>
+          <w:lang w:val="es-ES_tradnl"/>
+        </w:rPr>
+        <w:t>_occ_fecha_levantamiento}</w:t>
+      </w:r>
+      <w:r>
+        <w:rPr>
+          <w:color w:val="FF0000"/>
+          <w:sz w:val="24"/>
+          <w:szCs w:val="24"/>
+          <w:lang w:val="es-ES_tradnl"/>
+        </w:rPr>
+        <w:t xml:space="preserve">, a las </w:t>
+      </w:r>
+      <w:r>
+        <w:rPr>
+          <w:sz w:val="24"/>
+          <w:szCs w:val="24"/>
+          <w:lang w:val="es-ES_tradnl"/>
+        </w:rPr>
+        <w:t>${</w:t>
+      </w:r>
+      <w:r>
+        <w:rPr>
+          <w:sz w:val="24"/>
+          <w:szCs w:val="24"/>
+          <w:lang w:val="es-ES_tradnl"/>
+        </w:rPr>
+        <w:t>p1</w:t>
+      </w:r>
+      <w:r>
+        <w:rPr>
+          <w:sz w:val="24"/>
+          <w:szCs w:val="24"/>
+          <w:lang w:val="es-ES_tradnl"/>
+        </w:rPr>
+        <w:t>_occ_hora_levantamiento}</w:t>
+      </w:r>
+      <w:r>
+        <w:rPr>
+          <w:color w:val="FF0000"/>
+          <w:sz w:val="24"/>
+          <w:szCs w:val="24"/>
+          <w:lang w:val="es-ES_tradnl"/>
+        </w:rPr>
+        <w:t xml:space="preserve"> horas en la</w:t>
+      </w:r>
+      <w:r>
+        <w:rPr>
+          <w:color w:val="FF0000"/>
+          <w:sz w:val="24"/>
+          <w:szCs w:val="24"/>
+          <w:lang w:val="es-ES_tradnl"/>
+        </w:rPr>
+        <w:t xml:space="preserve"> </w:t>
+      </w:r>
+      <w:r>
+        <w:rPr>
+          <w:sz w:val="24"/>
+          <w:szCs w:val="24"/>
+          <w:lang w:val="es-ES_tradnl"/>
+        </w:rPr>
+        <w:t>${</w:t>
+      </w:r>
+      <w:r>
+        <w:rPr>
+          <w:sz w:val="24"/>
+          <w:szCs w:val="24"/>
+          <w:lang w:val="es-ES_tradnl"/>
+        </w:rPr>
+        <w:t>p1</w:t>
+      </w:r>
+      <w:r>
+        <w:rPr>
+          <w:sz w:val="24"/>
+          <w:szCs w:val="24"/>
+          <w:lang w:val="es-ES_tradnl"/>
+        </w:rPr>
+        <w:t>_occ_lugar_levantamiento}</w:t>
+      </w:r>
+      <w:r>
+        <w:rPr>
+          <w:color w:val="FF0000"/>
+          <w:sz w:val="24"/>
+          <w:szCs w:val="24"/>
+          <w:lang w:val="es-ES_tradnl"/>
+        </w:rPr>
+        <w:t xml:space="preserve">, por el personal policial de la </w:t>
+      </w:r>
       <w:proofErr w:type="spellStart"/>
       <w:r>
         <w:rPr>
-          <w:sz w:val="24"/>
-          <w:szCs w:val="24"/>
-          <w:lang w:val="es-ES_tradnl"/>
-        </w:rPr>
-        <w:t>PREFIX_occ_fecha_levantamiento</w:t>
+          <w:color w:val="FF0000"/>
+          <w:sz w:val="24"/>
+          <w:szCs w:val="24"/>
+          <w:lang w:val="es-ES_tradnl"/>
+        </w:rPr>
+        <w:t>uiat</w:t>
       </w:r>
       <w:proofErr w:type="spellEnd"/>
       <w:r>
         <w:rPr>
-          <w:sz w:val="24"/>
-          <w:szCs w:val="24"/>
-          <w:lang w:val="es-ES_tradnl"/>
-        </w:rPr>
-        <w:t>}</w:t>
-      </w:r>
-      <w:r>
-        <w:rPr>
-          <w:color w:val="FF0000"/>
-          <w:sz w:val="24"/>
-          <w:szCs w:val="24"/>
-          <w:lang w:val="es-ES_tradnl"/>
-        </w:rPr>
-        <w:t xml:space="preserve">, a las </w:t>
+          <w:color w:val="FF0000"/>
+          <w:sz w:val="24"/>
+          <w:szCs w:val="24"/>
+          <w:lang w:val="es-ES_tradnl"/>
+        </w:rPr>
+        <w:t xml:space="preserve"> norte; s</w:t>
+      </w:r>
+      <w:r>
+        <w:rPr>
+          <w:color w:val="FF0000"/>
+          <w:sz w:val="24"/>
+          <w:szCs w:val="24"/>
+          <w:lang w:val="es-ES_tradnl"/>
+        </w:rPr>
+        <w:t>t3</w:t>
+      </w:r>
+      <w:r>
+        <w:rPr>
+          <w:color w:val="FF0000"/>
+          <w:sz w:val="24"/>
+          <w:szCs w:val="24"/>
+          <w:lang w:val="es-ES_tradnl"/>
+        </w:rPr>
+        <w:t xml:space="preserve"> </w:t>
+      </w:r>
+      <w:proofErr w:type="spellStart"/>
+      <w:r>
+        <w:rPr>
+          <w:color w:val="FF0000"/>
+          <w:sz w:val="24"/>
+          <w:szCs w:val="24"/>
+          <w:lang w:val="es-ES_tradnl"/>
+        </w:rPr>
+        <w:t>pnp</w:t>
+      </w:r>
+      <w:proofErr w:type="spellEnd"/>
+      <w:r>
+        <w:rPr>
+          <w:color w:val="FF0000"/>
+          <w:sz w:val="24"/>
+          <w:szCs w:val="24"/>
+          <w:lang w:val="es-ES_tradnl"/>
+        </w:rPr>
+        <w:t xml:space="preserve">. </w:t>
+      </w:r>
+      <w:proofErr w:type="spellStart"/>
+      <w:r>
+        <w:rPr>
+          <w:color w:val="FF0000"/>
+          <w:sz w:val="24"/>
+          <w:szCs w:val="24"/>
+          <w:lang w:val="es-ES_tradnl"/>
+        </w:rPr>
+        <w:t>giancarlo</w:t>
+      </w:r>
+      <w:proofErr w:type="spellEnd"/>
+      <w:r>
+        <w:rPr>
+          <w:color w:val="FF0000"/>
+          <w:sz w:val="24"/>
+          <w:szCs w:val="24"/>
+          <w:lang w:val="es-ES_tradnl"/>
+        </w:rPr>
+        <w:t xml:space="preserve"> </w:t>
+      </w:r>
+      <w:proofErr w:type="spellStart"/>
+      <w:r>
+        <w:rPr>
+          <w:color w:val="FF0000"/>
+          <w:sz w:val="24"/>
+          <w:szCs w:val="24"/>
+          <w:lang w:val="es-ES_tradnl"/>
+        </w:rPr>
+        <w:t>jorge</w:t>
+      </w:r>
+      <w:proofErr w:type="spellEnd"/>
+      <w:r>
+        <w:rPr>
+          <w:color w:val="FF0000"/>
+          <w:sz w:val="24"/>
+          <w:szCs w:val="24"/>
+          <w:lang w:val="es-ES_tradnl"/>
+        </w:rPr>
+        <w:t xml:space="preserve"> merino sancho, él médico legista del instituto de medicina legal </w:t>
       </w:r>
       <w:r>
         <w:rPr>
@@ -1161,35 +1179,52 @@
         </w:rPr>
         <w:t>${</w:t>
       </w:r>
+      <w:r>
+        <w:rPr>
+          <w:sz w:val="24"/>
+          <w:szCs w:val="24"/>
+          <w:lang w:val="es-ES_tradnl"/>
+        </w:rPr>
+        <w:t>p1</w:t>
+      </w:r>
+      <w:r>
+        <w:rPr>
+          <w:sz w:val="24"/>
+          <w:szCs w:val="24"/>
+          <w:lang w:val="es-ES_tradnl"/>
+        </w:rPr>
+        <w:t>_occ_legista_levantamiento}</w:t>
+      </w:r>
+      <w:r>
+        <w:rPr>
+          <w:sz w:val="24"/>
+          <w:szCs w:val="24"/>
+          <w:lang w:val="es-ES_tradnl"/>
+        </w:rPr>
+        <w:t xml:space="preserve"> </w:t>
+      </w:r>
+      <w:r>
+        <w:rPr>
+          <w:color w:val="FF0000"/>
+          <w:sz w:val="24"/>
+          <w:szCs w:val="24"/>
+          <w:lang w:val="es-ES_tradnl"/>
+        </w:rPr>
+        <w:t xml:space="preserve">con </w:t>
+      </w:r>
       <w:proofErr w:type="spellStart"/>
       <w:r>
         <w:rPr>
-          <w:sz w:val="24"/>
-          <w:szCs w:val="24"/>
-          <w:lang w:val="es-ES_tradnl"/>
-        </w:rPr>
-        <w:t>PREFIX_occ_hora_levantamiento</w:t>
+          <w:color w:val="FF0000"/>
+          <w:sz w:val="24"/>
+          <w:szCs w:val="24"/>
+          <w:lang w:val="es-ES_tradnl"/>
+        </w:rPr>
+        <w:t>cmp</w:t>
       </w:r>
       <w:proofErr w:type="spellEnd"/>
       <w:r>
         <w:rPr>
-          <w:sz w:val="24"/>
-          <w:szCs w:val="24"/>
-          <w:lang w:val="es-ES_tradnl"/>
-        </w:rPr>
-        <w:t>}</w:t>
-      </w:r>
-      <w:r>
-        <w:rPr>
-          <w:color w:val="FF0000"/>
-          <w:sz w:val="24"/>
-          <w:szCs w:val="24"/>
-          <w:lang w:val="es-ES_tradnl"/>
-        </w:rPr>
-        <w:t xml:space="preserve"> horas en la</w:t>
-      </w:r>
-      <w:r>
-        <w:rPr>
           <w:color w:val="FF0000"/>
           <w:sz w:val="24"/>
           <w:szCs w:val="24"/>
@@ -1197,6 +1232,26 @@
         </w:rPr>
         <w:t xml:space="preserve"> </w:t>
       </w:r>
+      <w:proofErr w:type="spellStart"/>
+      <w:r>
+        <w:rPr>
+          <w:color w:val="FF0000"/>
+          <w:sz w:val="24"/>
+          <w:szCs w:val="24"/>
+          <w:lang w:val="es-ES_tradnl"/>
+        </w:rPr>
+        <w:t>n°</w:t>
+      </w:r>
+      <w:proofErr w:type="spellEnd"/>
+      <w:r>
+        <w:rPr>
+          <w:color w:val="FF0000"/>
+          <w:sz w:val="24"/>
+          <w:szCs w:val="24"/>
+          <w:lang w:val="es-ES_tradnl"/>
+        </w:rPr>
+        <w:t xml:space="preserve"> </w:t>
+      </w:r>
       <w:r>
         <w:rPr>
           <w:sz w:val="24"/>
@@ -1205,128 +1260,30 @@
         </w:rPr>
         <w:t>${</w:t>
       </w:r>
-      <w:proofErr w:type="spellStart"/>
-      <w:r>
-        <w:rPr>
-          <w:sz w:val="24"/>
-          <w:szCs w:val="24"/>
-          <w:lang w:val="es-ES_tradnl"/>
-        </w:rPr>
-        <w:t>PREFIX_occ_lugar_levantamiento</w:t>
-      </w:r>
-      <w:proofErr w:type="spellEnd"/>
-      <w:r>
-        <w:rPr>
-          <w:sz w:val="24"/>
-          <w:szCs w:val="24"/>
-          <w:lang w:val="es-ES_tradnl"/>
-        </w:rPr>
-        <w:t>}</w:t>
-      </w:r>
-      <w:r>
-        <w:rPr>
-          <w:color w:val="FF0000"/>
-          <w:sz w:val="24"/>
-          <w:szCs w:val="24"/>
-          <w:lang w:val="es-ES_tradnl"/>
-        </w:rPr>
-        <w:t>, por el personal policial de la UIAT Norte; S</w:t>
-      </w:r>
-      <w:r>
-        <w:rPr>
-          <w:color w:val="FF0000"/>
-          <w:sz w:val="24"/>
-          <w:szCs w:val="24"/>
-          <w:lang w:val="es-ES_tradnl"/>
-        </w:rPr>
-        <w:t>T3</w:t>
-      </w:r>
-      <w:r>
-        <w:rPr>
-          <w:color w:val="FF0000"/>
-          <w:sz w:val="24"/>
-          <w:szCs w:val="24"/>
-          <w:lang w:val="es-ES_tradnl"/>
-        </w:rPr>
-        <w:t xml:space="preserve"> PNP. Giancarlo Jorge MERINO SANCHO, él médico legista del Instituto de Medicina Legal </w:t>
-      </w:r>
-      <w:r>
-        <w:rPr>
-          <w:sz w:val="24"/>
-          <w:szCs w:val="24"/>
-          <w:lang w:val="es-ES_tradnl"/>
-        </w:rPr>
-        <w:t>${</w:t>
-      </w:r>
-      <w:proofErr w:type="spellStart"/>
-      <w:r>
-        <w:rPr>
-          <w:sz w:val="24"/>
-          <w:szCs w:val="24"/>
-          <w:lang w:val="es-ES_tradnl"/>
-        </w:rPr>
-        <w:t>PREFIX_occ_legista_levantamiento</w:t>
-      </w:r>
-      <w:proofErr w:type="spellEnd"/>
-      <w:r>
-        <w:rPr>
-          <w:sz w:val="24"/>
-          <w:szCs w:val="24"/>
-          <w:lang w:val="es-ES_tradnl"/>
-        </w:rPr>
-        <w:t>}</w:t>
-      </w:r>
-      <w:r>
-        <w:rPr>
-          <w:sz w:val="24"/>
-          <w:szCs w:val="24"/>
-          <w:lang w:val="es-ES_tradnl"/>
-        </w:rPr>
-        <w:t xml:space="preserve"> </w:t>
-      </w:r>
-      <w:r>
-        <w:rPr>
-          <w:color w:val="FF0000"/>
-          <w:sz w:val="24"/>
-          <w:szCs w:val="24"/>
-          <w:lang w:val="es-ES_tradnl"/>
-        </w:rPr>
-        <w:t xml:space="preserve">con CMP N° </w:t>
-      </w:r>
-      <w:r>
-        <w:rPr>
-          <w:sz w:val="24"/>
-          <w:szCs w:val="24"/>
-          <w:lang w:val="es-ES_tradnl"/>
-        </w:rPr>
-        <w:t>${</w:t>
-      </w:r>
-      <w:proofErr w:type="spellStart"/>
-      <w:r>
-        <w:rPr>
-          <w:sz w:val="24"/>
-          <w:szCs w:val="24"/>
-          <w:lang w:val="es-ES_tradnl"/>
-        </w:rPr>
-        <w:t>PREFIX_occ_cmp_legista</w:t>
-      </w:r>
-      <w:proofErr w:type="spellEnd"/>
-      <w:r>
-        <w:rPr>
-          <w:sz w:val="24"/>
-          <w:szCs w:val="24"/>
-          <w:lang w:val="es-ES_tradnl"/>
-        </w:rPr>
-        <w:t>}</w:t>
-      </w:r>
-      <w:r>
-        <w:rPr>
-          <w:color w:val="FF0000"/>
-          <w:sz w:val="24"/>
-          <w:szCs w:val="24"/>
-          <w:lang w:val="es-ES_tradnl"/>
-        </w:rPr>
-        <w:t xml:space="preserve"> y el representante del Ministerio Público, </w:t>
+      <w:r>
+        <w:rPr>
+          <w:sz w:val="24"/>
+          <w:szCs w:val="24"/>
+          <w:lang w:val="es-ES_tradnl"/>
+        </w:rPr>
+        <w:t>p1</w:t>
+      </w:r>
+      <w:r>
+        <w:rPr>
+          <w:sz w:val="24"/>
+          <w:szCs w:val="24"/>
+          <w:lang w:val="es-ES_tradnl"/>
+        </w:rPr>
+        <w:t>_occ_cmp_legista}</w:t>
+      </w:r>
+      <w:r>
+        <w:rPr>
+          <w:color w:val="FF0000"/>
+          <w:sz w:val="24"/>
+          <w:szCs w:val="24"/>
+          <w:lang w:val="es-ES_tradnl"/>
+        </w:rPr>
+        <w:t xml:space="preserve"> y el representante del ministerio público, </w:t>
       </w:r>
       <w:r>
         <w:rPr>
@@ -1470,23 +1427,21 @@
         </w:rPr>
         <w:t>${</w:t>
       </w:r>
-      <w:proofErr w:type="spellStart"/>
-      <w:r>
-        <w:rPr>
-          <w:sz w:val="24"/>
-          <w:szCs w:val="24"/>
-          <w:lang w:val="es-ES_tradnl"/>
-        </w:rPr>
-        <w:t>PREFIX_occ_lesiones_levantamiento</w:t>
-      </w:r>
-      <w:proofErr w:type="spellEnd"/>
-      <w:r>
-        <w:rPr>
-          <w:sz w:val="24"/>
-          <w:szCs w:val="24"/>
-          <w:lang w:val="es-ES_tradnl"/>
-        </w:rPr>
-        <w:t>}</w:t>
+      <w:r>
+        <w:rPr>
+          <w:sz w:val="24"/>
+          <w:szCs w:val="24"/>
+          <w:lang w:val="es-ES_tradnl"/>
+        </w:rPr>
+        <w:t>p1</w:t>
+      </w:r>
+      <w:r>
+        <w:rPr>
+          <w:sz w:val="24"/>
+          <w:szCs w:val="24"/>
+          <w:lang w:val="es-ES_tradnl"/>
+        </w:rPr>
+        <w:t>_occ_lesiones_levantamiento}</w:t>
       </w:r>
     </w:p>
     <w:p>
@@ -1561,41 +1516,23 @@
           <w:szCs w:val="24"/>
           <w:lang w:val="es-ES_tradnl"/>
         </w:rPr>
-        <w:t>“</w:t>
-      </w:r>
-      <w:r>
-        <w:rPr>
-          <w:sz w:val="24"/>
-          <w:szCs w:val="24"/>
-          <w:lang w:val="es-ES_tradnl"/>
-        </w:rPr>
-        <w:t>${</w:t>
-      </w:r>
-      <w:proofErr w:type="spellStart"/>
-      <w:r>
-        <w:rPr>
-          <w:sz w:val="24"/>
-          <w:szCs w:val="24"/>
-          <w:lang w:val="es-ES_tradnl"/>
-        </w:rPr>
-        <w:t>PREFIX_occ_presuntivo_levantamiento</w:t>
-      </w:r>
-      <w:proofErr w:type="spellEnd"/>
-      <w:r>
-        <w:rPr>
-          <w:sz w:val="24"/>
-          <w:szCs w:val="24"/>
-          <w:lang w:val="es-ES_tradnl"/>
-        </w:rPr>
-        <w:t>}</w:t>
-      </w:r>
-      <w:r>
-        <w:rPr>
-          <w:sz w:val="24"/>
-          <w:szCs w:val="24"/>
-          <w:lang w:val="es-ES_tradnl"/>
-        </w:rPr>
-        <w:t>”</w:t>
+        <w:t>“${</w:t>
+      </w:r>
+      <w:r>
+        <w:rPr>
+          <w:sz w:val="24"/>
+          <w:szCs w:val="24"/>
+          <w:lang w:val="es-ES_tradnl"/>
+        </w:rPr>
+        <w:t>p1</w:t>
+      </w:r>
+      <w:r>
+        <w:rPr>
+          <w:sz w:val="24"/>
+          <w:szCs w:val="24"/>
+          <w:lang w:val="es-ES_tradnl"/>
+        </w:rPr>
+        <w:t>_occ_presuntivo_levantamiento}”</w:t>
       </w:r>
     </w:p>
     <w:bookmarkEnd w:id="3"/>
@@ -1651,25 +1588,110 @@
         <w:t xml:space="preserve">Nº </w:t>
       </w:r>
       <w:r>
+        <w:t>${p1_occ_numero_pericial}</w:t>
+      </w:r>
+      <w:r>
+        <w:rPr>
+          <w:color w:val="FF0000"/>
+          <w:sz w:val="24"/>
+          <w:szCs w:val="24"/>
+          <w:lang w:val="es-ES_tradnl"/>
+        </w:rPr>
+        <w:t xml:space="preserve"> de fecha</w:t>
+      </w:r>
+      <w:r>
+        <w:rPr>
+          <w:color w:val="FF0000"/>
+          <w:sz w:val="24"/>
+          <w:szCs w:val="24"/>
+          <w:lang w:val="es-ES_tradnl"/>
+        </w:rPr>
+        <w:t xml:space="preserve"> </w:t>
+      </w:r>
+      <w:r>
+        <w:rPr>
+          <w:sz w:val="24"/>
+          <w:szCs w:val="24"/>
+          <w:lang w:val="es-ES_tradnl"/>
+        </w:rPr>
         <w:t>${</w:t>
       </w:r>
+      <w:r>
+        <w:rPr>
+          <w:sz w:val="24"/>
+          <w:szCs w:val="24"/>
+          <w:lang w:val="es-ES_tradnl"/>
+        </w:rPr>
+        <w:t>p1</w:t>
+      </w:r>
+      <w:r>
+        <w:rPr>
+          <w:sz w:val="24"/>
+          <w:szCs w:val="24"/>
+          <w:lang w:val="es-ES_tradnl"/>
+        </w:rPr>
+        <w:t>_occ_fecha_pericial}</w:t>
+      </w:r>
+      <w:r>
+        <w:rPr>
+          <w:color w:val="FF0000"/>
+          <w:sz w:val="24"/>
+          <w:szCs w:val="24"/>
+          <w:lang w:val="es-ES_tradnl"/>
+        </w:rPr>
+        <w:t xml:space="preserve">, expedido por la </w:t>
+      </w:r>
       <w:proofErr w:type="spellStart"/>
       <w:r>
-        <w:t>PREFIX_occ_numero_pericial</w:t>
+        <w:rPr>
+          <w:color w:val="FF0000"/>
+          <w:sz w:val="24"/>
+          <w:szCs w:val="24"/>
+          <w:lang w:val="es-ES_tradnl"/>
+        </w:rPr>
+        <w:t>ditanfor</w:t>
       </w:r>
       <w:proofErr w:type="spellEnd"/>
       <w:r>
-        <w:t>}</w:t>
-      </w:r>
-      <w:r>
-        <w:rPr>
-          <w:color w:val="FF0000"/>
-          <w:sz w:val="24"/>
-          <w:szCs w:val="24"/>
-          <w:lang w:val="es-ES_tradnl"/>
-        </w:rPr>
-        <w:t xml:space="preserve"> de fecha</w:t>
-      </w:r>
+        <w:rPr>
+          <w:color w:val="FF0000"/>
+          <w:sz w:val="24"/>
+          <w:szCs w:val="24"/>
+          <w:lang w:val="es-ES_tradnl"/>
+        </w:rPr>
+        <w:t xml:space="preserve">-lima, el cual se adjunta al presente correspondiente </w:t>
+      </w:r>
+      <w:proofErr w:type="gramStart"/>
+      <w:r>
+        <w:rPr>
+          <w:color w:val="FF0000"/>
+          <w:sz w:val="24"/>
+          <w:szCs w:val="24"/>
+          <w:lang w:val="es-ES_tradnl"/>
+        </w:rPr>
+        <w:t xml:space="preserve">a  </w:t>
+      </w:r>
+      <w:proofErr w:type="spellStart"/>
+      <w:r>
+        <w:rPr>
+          <w:color w:val="FF0000"/>
+          <w:sz w:val="24"/>
+          <w:szCs w:val="24"/>
+          <w:lang w:val="es-ES_tradnl"/>
+        </w:rPr>
+        <w:t>q.e.v.f</w:t>
+      </w:r>
+      <w:proofErr w:type="spellEnd"/>
+      <w:r>
+        <w:rPr>
+          <w:color w:val="FF0000"/>
+          <w:sz w:val="24"/>
+          <w:szCs w:val="24"/>
+          <w:lang w:val="es-ES_tradnl"/>
+        </w:rPr>
+        <w:t>.</w:t>
+      </w:r>
+      <w:proofErr w:type="gramEnd"/>
       <w:r>
         <w:rPr>
           <w:color w:val="FF0000"/>
@@ -1685,90 +1707,24 @@
           <w:szCs w:val="24"/>
           <w:lang w:val="es-ES_tradnl"/>
         </w:rPr>
+        <w:lastRenderedPageBreak/>
         <w:t>${</w:t>
       </w:r>
-      <w:proofErr w:type="spellStart"/>
-      <w:r>
-        <w:rPr>
-          <w:sz w:val="24"/>
-          <w:szCs w:val="24"/>
-          <w:lang w:val="es-ES_tradnl"/>
-        </w:rPr>
-        <w:t>PREFIX_occ_fecha_pericial</w:t>
-      </w:r>
-      <w:proofErr w:type="spellEnd"/>
-      <w:r>
-        <w:rPr>
-          <w:sz w:val="24"/>
-          <w:szCs w:val="24"/>
-          <w:lang w:val="es-ES_tradnl"/>
-        </w:rPr>
-        <w:t>}</w:t>
-      </w:r>
-      <w:r>
-        <w:rPr>
-          <w:color w:val="FF0000"/>
-          <w:sz w:val="24"/>
-          <w:szCs w:val="24"/>
-          <w:lang w:val="es-ES_tradnl"/>
-        </w:rPr>
-        <w:t xml:space="preserve">, expedido por la DITANFOR-Lima, el cual se adjunta al presente </w:t>
-      </w:r>
-      <w:r>
-        <w:rPr>
-          <w:color w:val="FF0000"/>
-          <w:sz w:val="24"/>
-          <w:szCs w:val="24"/>
-          <w:lang w:val="es-ES_tradnl"/>
-        </w:rPr>
-        <w:lastRenderedPageBreak/>
-        <w:t xml:space="preserve">correspondiente </w:t>
-      </w:r>
-      <w:proofErr w:type="gramStart"/>
-      <w:r>
-        <w:rPr>
-          <w:color w:val="FF0000"/>
-          <w:sz w:val="24"/>
-          <w:szCs w:val="24"/>
-          <w:lang w:val="es-ES_tradnl"/>
-        </w:rPr>
-        <w:t>a  Q.E.V.F.</w:t>
-      </w:r>
-      <w:proofErr w:type="gramEnd"/>
-      <w:r>
-        <w:rPr>
-          <w:color w:val="FF0000"/>
-          <w:sz w:val="24"/>
-          <w:szCs w:val="24"/>
-          <w:lang w:val="es-ES_tradnl"/>
-        </w:rPr>
-        <w:t xml:space="preserve"> </w:t>
-      </w:r>
-      <w:r>
-        <w:rPr>
-          <w:sz w:val="24"/>
-          <w:szCs w:val="24"/>
-          <w:lang w:val="es-ES_tradnl"/>
-        </w:rPr>
-        <w:t>${</w:t>
-      </w:r>
-      <w:proofErr w:type="spellStart"/>
-      <w:r>
-        <w:rPr>
-          <w:sz w:val="24"/>
-          <w:szCs w:val="24"/>
-          <w:lang w:val="es-ES_tradnl"/>
-        </w:rPr>
-        <w:t>PREFIX_fall_nombre</w:t>
-      </w:r>
-      <w:proofErr w:type="spellEnd"/>
-      <w:r>
-        <w:rPr>
-          <w:sz w:val="24"/>
-          <w:szCs w:val="24"/>
-          <w:lang w:val="es-ES_tradnl"/>
-        </w:rPr>
-        <w:t>}</w:t>
+      <w:r>
+        <w:rPr>
+          <w:sz w:val="24"/>
+          <w:szCs w:val="24"/>
+          <w:lang w:val="es-ES_tradnl"/>
+        </w:rPr>
+        <w:t>p1</w:t>
+      </w:r>
+      <w:r>
+        <w:rPr>
+          <w:sz w:val="24"/>
+          <w:szCs w:val="24"/>
+          <w:lang w:val="es-ES_tradnl"/>
+        </w:rPr>
+        <w:t>_fall_nombre}</w:t>
       </w:r>
       <w:r>
         <w:rPr>
@@ -1830,7 +1786,16 @@
           <w:szCs w:val="24"/>
           <w:lang w:val="es-ES_tradnl"/>
         </w:rPr>
-        <w:t>Fue sometido a la pericia de Dosaje Etílico, por personal médico de la unidad desconcentrada de dosaje etílico, el</w:t>
+        <w:t xml:space="preserve">Fue </w:t>
+      </w:r>
+      <w:r>
+        <w:rPr>
+          <w:color w:val="FF0000"/>
+          <w:sz w:val="24"/>
+          <w:szCs w:val="24"/>
+          <w:lang w:val="es-ES_tradnl"/>
+        </w:rPr>
+        <w:t>sometido a la pericia de dosaje etílico, por personal médico de la unidad desconcentrada de dosaje etílico, el</w:t>
       </w:r>
       <w:r>
         <w:rPr>
@@ -1849,35 +1814,44 @@
         </w:rPr>
         <w:t>${</w:t>
       </w:r>
+      <w:r>
+        <w:rPr>
+          <w:sz w:val="24"/>
+          <w:szCs w:val="24"/>
+          <w:lang w:val="es-ES_tradnl"/>
+        </w:rPr>
+        <w:t>p1</w:t>
+      </w:r>
+      <w:r>
+        <w:rPr>
+          <w:sz w:val="24"/>
+          <w:szCs w:val="24"/>
+          <w:lang w:val="es-ES_tradnl"/>
+        </w:rPr>
+        <w:t>_fall_dosaje_fecha}</w:t>
+      </w:r>
+      <w:r>
+        <w:rPr>
+          <w:color w:val="FF0000"/>
+          <w:sz w:val="24"/>
+          <w:szCs w:val="24"/>
+          <w:lang w:val="es-ES_tradnl"/>
+        </w:rPr>
+        <w:t xml:space="preserve">, donde expidieron el certificado </w:t>
+      </w:r>
       <w:proofErr w:type="spellStart"/>
       <w:r>
         <w:rPr>
-          <w:sz w:val="24"/>
-          <w:szCs w:val="24"/>
-          <w:lang w:val="es-ES_tradnl"/>
-        </w:rPr>
-        <w:t>PREFIX_fall_dosaje_fecha</w:t>
+          <w:color w:val="FF0000"/>
+          <w:sz w:val="24"/>
+          <w:szCs w:val="24"/>
+          <w:lang w:val="es-ES_tradnl"/>
+        </w:rPr>
+        <w:t>n°</w:t>
       </w:r>
       <w:proofErr w:type="spellEnd"/>
       <w:r>
         <w:rPr>
-          <w:sz w:val="24"/>
-          <w:szCs w:val="24"/>
-          <w:lang w:val="es-ES_tradnl"/>
-        </w:rPr>
-        <w:t>}</w:t>
-      </w:r>
-      <w:r>
-        <w:rPr>
-          <w:color w:val="FF0000"/>
-          <w:sz w:val="24"/>
-          <w:szCs w:val="24"/>
-          <w:lang w:val="es-ES_tradnl"/>
-        </w:rPr>
-        <w:t>, donde expidieron el Certificado N°</w:t>
-      </w:r>
-      <w:r>
-        <w:rPr>
           <w:color w:val="FF0000"/>
           <w:sz w:val="24"/>
           <w:szCs w:val="24"/>
@@ -1893,23 +1867,21 @@
         </w:rPr>
         <w:t>${</w:t>
       </w:r>
-      <w:proofErr w:type="spellStart"/>
-      <w:r>
-        <w:rPr>
-          <w:sz w:val="24"/>
-          <w:szCs w:val="24"/>
-          <w:lang w:val="es-ES_tradnl"/>
-        </w:rPr>
-        <w:t>PREFIX_fall_dosaje_numero</w:t>
-      </w:r>
-      <w:proofErr w:type="spellEnd"/>
-      <w:r>
-        <w:rPr>
-          <w:sz w:val="24"/>
-          <w:szCs w:val="24"/>
-          <w:lang w:val="es-ES_tradnl"/>
-        </w:rPr>
-        <w:t>}</w:t>
+      <w:r>
+        <w:rPr>
+          <w:sz w:val="24"/>
+          <w:szCs w:val="24"/>
+          <w:lang w:val="es-ES_tradnl"/>
+        </w:rPr>
+        <w:t>p1</w:t>
+      </w:r>
+      <w:r>
+        <w:rPr>
+          <w:sz w:val="24"/>
+          <w:szCs w:val="24"/>
+          <w:lang w:val="es-ES_tradnl"/>
+        </w:rPr>
+        <w:t>_fall_dosaje_numero}</w:t>
       </w:r>
       <w:r>
         <w:rPr>
@@ -1928,23 +1900,21 @@
         </w:rPr>
         <w:t>${</w:t>
       </w:r>
-      <w:proofErr w:type="spellStart"/>
-      <w:r>
-        <w:rPr>
-          <w:sz w:val="24"/>
-          <w:szCs w:val="24"/>
-          <w:lang w:val="es-ES_tradnl"/>
-        </w:rPr>
-        <w:t>PREFIX_fall_dosaje_registro</w:t>
-      </w:r>
-      <w:proofErr w:type="spellEnd"/>
-      <w:r>
-        <w:rPr>
-          <w:sz w:val="24"/>
-          <w:szCs w:val="24"/>
-          <w:lang w:val="es-ES_tradnl"/>
-        </w:rPr>
-        <w:t>}</w:t>
+      <w:r>
+        <w:rPr>
+          <w:sz w:val="24"/>
+          <w:szCs w:val="24"/>
+          <w:lang w:val="es-ES_tradnl"/>
+        </w:rPr>
+        <w:t>p1</w:t>
+      </w:r>
+      <w:r>
+        <w:rPr>
+          <w:sz w:val="24"/>
+          <w:szCs w:val="24"/>
+          <w:lang w:val="es-ES_tradnl"/>
+        </w:rPr>
+        <w:t>_fall_dosaje_registro}</w:t>
       </w:r>
       <w:r>
         <w:rPr>
@@ -1981,23 +1951,21 @@
         </w:rPr>
         <w:t>${</w:t>
       </w:r>
-      <w:proofErr w:type="spellStart"/>
-      <w:r>
-        <w:rPr>
-          <w:sz w:val="24"/>
-          <w:szCs w:val="24"/>
-          <w:lang w:val="es-ES_tradnl"/>
-        </w:rPr>
-        <w:t>PREFIX_fall_dosaje_resultado_cual</w:t>
-      </w:r>
-      <w:proofErr w:type="spellEnd"/>
-      <w:r>
-        <w:rPr>
-          <w:sz w:val="24"/>
-          <w:szCs w:val="24"/>
-          <w:lang w:val="es-ES_tradnl"/>
-        </w:rPr>
-        <w:t>}</w:t>
+      <w:r>
+        <w:rPr>
+          <w:sz w:val="24"/>
+          <w:szCs w:val="24"/>
+          <w:lang w:val="es-ES_tradnl"/>
+        </w:rPr>
+        <w:t>p1</w:t>
+      </w:r>
+      <w:r>
+        <w:rPr>
+          <w:sz w:val="24"/>
+          <w:szCs w:val="24"/>
+          <w:lang w:val="es-ES_tradnl"/>
+        </w:rPr>
+        <w:t>_fall_dosaje_resultado_cual}</w:t>
       </w:r>
       <w:r>
         <w:rPr>
@@ -2033,23 +2001,21 @@
         </w:rPr>
         <w:t>${</w:t>
       </w:r>
-      <w:proofErr w:type="spellStart"/>
-      <w:r>
-        <w:rPr>
-          <w:sz w:val="24"/>
-          <w:szCs w:val="24"/>
-          <w:lang w:val="es-ES_tradnl"/>
-        </w:rPr>
-        <w:t>PREFIX_fall_dosaje_lectura_cuant</w:t>
-      </w:r>
-      <w:proofErr w:type="spellEnd"/>
-      <w:r>
-        <w:rPr>
-          <w:sz w:val="24"/>
-          <w:szCs w:val="24"/>
-          <w:lang w:val="es-ES_tradnl"/>
-        </w:rPr>
-        <w:t>}</w:t>
+      <w:r>
+        <w:rPr>
+          <w:sz w:val="24"/>
+          <w:szCs w:val="24"/>
+          <w:lang w:val="es-ES_tradnl"/>
+        </w:rPr>
+        <w:t>p1</w:t>
+      </w:r>
+      <w:r>
+        <w:rPr>
+          <w:sz w:val="24"/>
+          <w:szCs w:val="24"/>
+          <w:lang w:val="es-ES_tradnl"/>
+        </w:rPr>
+        <w:t>_fall_dosaje_lectura_cuant}</w:t>
       </w:r>
       <w:r>
         <w:rPr>
@@ -2120,24 +2086,19 @@
         <w:t xml:space="preserve">Certificado </w:t>
       </w:r>
       <w:r>
-        <w:t>${PREFIX_occ_numero_protocolo}</w:t>
-      </w:r>
-      <w:r>
-        <w:t xml:space="preserve">, de fecha </w:t>
-      </w:r>
-      <w:r>
         <w:t>${</w:t>
       </w:r>
-      <w:proofErr w:type="spellStart"/>
-      <w:r>
-        <w:t>PREFIX_occ_fecha_protocolo</w:t>
-      </w:r>
-      <w:proofErr w:type="spellEnd"/>
-      <w:r>
-        <w:t>}</w:t>
-      </w:r>
-      <w:r>
-        <w:t>, donde se consignan las siguientes lesiones:</w:t>
+      <w:r>
+        <w:t>p1</w:t>
+      </w:r>
+      <w:r>
+        <w:t>_occ_numero_protocolo}, de fecha ${</w:t>
+      </w:r>
+      <w:r>
+        <w:t>p1</w:t>
+      </w:r>
+      <w:r>
+        <w:t>_occ_fecha_protocolo}, donde se consignan las siguientes lesiones:</w:t>
       </w:r>
     </w:p>
     <w:p>
@@ -2181,13 +2142,11 @@
       <w:r>
         <w:t>${</w:t>
       </w:r>
-      <w:proofErr w:type="spellStart"/>
-      <w:r>
-        <w:t>PREFIX_occ_dosaje_protocolo</w:t>
-      </w:r>
-      <w:proofErr w:type="spellEnd"/>
-      <w:r>
-        <w:t>}</w:t>
+      <w:r>
+        <w:t>p1</w:t>
+      </w:r>
+      <w:r>
+        <w:t>_occ_dosaje_protocolo}</w:t>
       </w:r>
     </w:p>
     <w:p>
@@ -2236,13 +2195,11 @@
       <w:r>
         <w:t>${</w:t>
       </w:r>
-      <w:proofErr w:type="spellStart"/>
-      <w:r>
-        <w:t>PREFIX_occ_dosaje_protocolo</w:t>
-      </w:r>
-      <w:proofErr w:type="spellEnd"/>
-      <w:r>
-        <w:t>}</w:t>
+      <w:r>
+        <w:t>p1</w:t>
+      </w:r>
+      <w:r>
+        <w:t>_occ_dosaje_protocolo}</w:t>
       </w:r>
     </w:p>
     <w:p>
@@ -2305,13 +2262,14 @@
       <w:r>
         <w:t>${</w:t>
       </w:r>
-      <w:proofErr w:type="spellStart"/>
-      <w:r>
-        <w:t>PREFIX_occ_presuntivo_protocolo</w:t>
-      </w:r>
-      <w:proofErr w:type="spellEnd"/>
-      <w:r>
-        <w:t>}</w:t>
+      <w:r>
+        <w:t>p</w:t>
+      </w:r>
+      <w:r>
+        <w:t>1</w:t>
+      </w:r>
+      <w:r>
+        <w:t>_occ_presuntivo_protocolo}</w:t>
       </w:r>
     </w:p>
     <w:p>

</xml_diff>

<commit_message>
Se agrego ANALISIS DEL INFORME al proyecto
</commit_message>
<xml_diff>
--- a/plantillas/word_informe_peaton_fallecido.docx
+++ b/plantillas/word_informe_peaton_fallecido.docx
@@ -468,7 +468,10 @@
         <w:t>${</w:t>
       </w:r>
       <w:r>
-        <w:t>P1</w:t>
+        <w:t>p</w:t>
+      </w:r>
+      <w:r>
+        <w:t>1</w:t>
       </w:r>
       <w:r>
         <w:t>_fam_parentesco}</w:t>
@@ -1382,6 +1385,9 @@
     <w:p>
       <w:pPr>
         <w:pStyle w:val="Prrafodelista"/>
+        <w:tabs>
+          <w:tab w:val="left" w:pos="5673"/>
+        </w:tabs>
         <w:ind w:left="1176" w:firstLine="0"/>
         <w:jc w:val="both"/>
         <w:rPr>

</xml_diff>